<commit_message>
1-ogohlantirish: asosiy qarz va xayriya to'lovi xatda alohida ko'rsatiladi
Co-Authored-By: Claude Sonnet 5.5 <noreply@anthropic.com>
Claude-Session: https://claude.ai/code/session_018Dq4bhCQ4myEvnW12Zfe1Z
</commit_message>
<xml_diff>
--- a/templates/1-OGOHLANTIRISH-NAMUNA.docx
+++ b/templates/1-OGOHLANTIRISH-NAMUNA.docx
@@ -487,7 +487,7 @@
           <w:sz w:val="26"/>
           <w:szCs w:val="26"/>
         </w:rPr>
-        <w:t>}) kalendar kunga kechiktirilgan. Natijada jami {oylik_to</w:t>
+        <w:t>}) kalendar kunga kechiktirilgan. Natijada {oylik_to</w:t>
       </w:r>
       <w:r>
         <w:rPr>
@@ -538,7 +538,7 @@
           <w:sz w:val="26"/>
           <w:szCs w:val="26"/>
         </w:rPr>
-        <w:t>}) so‘m miqdorida qarzdorlik, shu jumladan {xayriya_summasi} ({xayriya_summasi</w:t>
+        <w:t>}) so‘m miqdorida qarzdorlik hamda {xayriya_summasi} ({xayriya_summasi</w:t>
       </w:r>
       <w:r>
         <w:rPr>
@@ -573,7 +573,7 @@
           <w:sz w:val="26"/>
           <w:szCs w:val="26"/>
         </w:rPr>
-        <w:t>}) miqdorida hayriya to‘lovi hisoblangan.</w:t>
+        <w:t>}) so‘m miqdorida hayriya to‘lovi hisoblangan.</w:t>
       </w:r>
     </w:p>
     <w:p>

</xml_diff>

<commit_message>
1-ogohlantirish: asosiy qarz va xayriya to'lovi xatda alohida ko'rsatiladi (#25)
Claude-Session: https://claude.ai/code/session_018Dq4bhCQ4myEvnW12Zfe1Z

Co-authored-by: Claude <noreply@anthropic.com>
</commit_message>
<xml_diff>
--- a/templates/1-OGOHLANTIRISH-NAMUNA.docx
+++ b/templates/1-OGOHLANTIRISH-NAMUNA.docx
@@ -487,7 +487,7 @@
           <w:sz w:val="26"/>
           <w:szCs w:val="26"/>
         </w:rPr>
-        <w:t>}) kalendar kunga kechiktirilgan. Natijada jami {oylik_to</w:t>
+        <w:t>}) kalendar kunga kechiktirilgan. Natijada {oylik_to</w:t>
       </w:r>
       <w:r>
         <w:rPr>
@@ -538,7 +538,7 @@
           <w:sz w:val="26"/>
           <w:szCs w:val="26"/>
         </w:rPr>
-        <w:t>}) so‘m miqdorida qarzdorlik, shu jumladan {xayriya_summasi} ({xayriya_summasi</w:t>
+        <w:t>}) so‘m miqdorida qarzdorlik hamda {xayriya_summasi} ({xayriya_summasi</w:t>
       </w:r>
       <w:r>
         <w:rPr>
@@ -573,7 +573,7 @@
           <w:sz w:val="26"/>
           <w:szCs w:val="26"/>
         </w:rPr>
-        <w:t>}) miqdorida hayriya to‘lovi hisoblangan.</w:t>
+        <w:t>}) so‘m miqdorida hayriya to‘lovi hisoblangan.</w:t>
       </w:r>
     </w:p>
     <w:p>

</xml_diff>

<commit_message>
Ogohlantirish xatlari: shartnoma turiga qarab Murobaha (nasiya savdo oldi-sotdi) yoki Lizing (moliyaviy ijara) matni
Co-Authored-By: Claude Sonnet 5.5 <noreply@anthropic.com>
Claude-Session: https://claude.ai/code/session_018Dq4bhCQ4myEvnW12Zfe1Z
</commit_message>
<xml_diff>
--- a/templates/1-OGOHLANTIRISH-NAMUNA.docx
+++ b/templates/1-OGOHLANTIRISH-NAMUNA.docx
@@ -393,7 +393,7 @@
           <w:sz w:val="26"/>
           <w:szCs w:val="26"/>
         </w:rPr>
-        <w:t>}da {shartnoma_raqami}-sonli aktivni nasiya savdo shartnomasi (keyingi o‘rinlarda — Shartnoma) tuzilgan bo‘lib, mazkur Shartnoma asosida Sizga nasiya savdo xizmati ko‘rsatilgan.</w:t>
+        <w:t>}da {shartnoma_raqami}-sonli aktivni {shartnoma_turi} (keyingi o‘rinlarda — Shartnoma) tuzilgan bo‘lib, mazkur Shartnoma asosida Sizga {xizmat_turi} ko‘rsatilgan.</w:t>
       </w:r>
     </w:p>
     <w:p>
@@ -413,7 +413,7 @@
           <w:sz w:val="26"/>
           <w:szCs w:val="26"/>
         </w:rPr>
-        <w:t xml:space="preserve">Shartnomaning ajralmas qismi hisoblangan 1-ilovaga muvofiq, nasiya to‘lovlari har oyning </w:t>
+        <w:t xml:space="preserve">Shartnomaning ajralmas qismi hisoblangan 1-ilovaga muvofiq, {tolov_turi} har oyning </w:t>
       </w:r>
       <w:r>
         <w:rPr>
@@ -450,7 +450,7 @@
           <w:sz w:val="26"/>
           <w:szCs w:val="26"/>
         </w:rPr>
-        <w:t>Shuningdek, Shartnoma shartlariga ko‘ra, nasiya to‘lovlari belgilangan muddatda amalga oshirilmagan taqdirda, kechiktirilgan har bir kalendar kun uchun kechiktirilgan to‘lov summasining 0,4 foizi miqdorida hayriya to‘lovi hisoblanishi nazarda tutilgan.</w:t>
+        <w:t>Shuningdek, Shartnoma shartlariga ko‘ra, {tolov_turi} belgilangan muddatda amalga oshirilmagan taqdirda, kechiktirilgan har bir kalendar kun uchun kechiktirilgan to‘lov summasining 0,4 foizi miqdorida hayriya to‘lovi hisoblanishi nazarda tutilgan.</w:t>
       </w:r>
     </w:p>
     <w:p>
@@ -671,7 +671,7 @@
           <w:szCs w:val="26"/>
         </w:rPr>
         <w:tab/>
-        <w:t>Nasiya savdo obyektini qaytarish bo‘yicha choralar ko‘rish;</w:t>
+        <w:t>{obyekt_turi} qaytarish bo‘yicha choralar ko‘rish;</w:t>
       </w:r>
     </w:p>
     <w:p>

</xml_diff>

<commit_message>
Ogohlantirish xatlari: shartnoma turiga qarab Murobaha (nasiya savdo oldi-sotdi) yoki Lizing (moliyaviy ijara) matni (#28)
Claude-Session: https://claude.ai/code/session_018Dq4bhCQ4myEvnW12Zfe1Z

Co-authored-by: Claude <noreply@anthropic.com>
</commit_message>
<xml_diff>
--- a/templates/1-OGOHLANTIRISH-NAMUNA.docx
+++ b/templates/1-OGOHLANTIRISH-NAMUNA.docx
@@ -393,7 +393,7 @@
           <w:sz w:val="26"/>
           <w:szCs w:val="26"/>
         </w:rPr>
-        <w:t>}da {shartnoma_raqami}-sonli aktivni nasiya savdo shartnomasi (keyingi o‘rinlarda — Shartnoma) tuzilgan bo‘lib, mazkur Shartnoma asosida Sizga nasiya savdo xizmati ko‘rsatilgan.</w:t>
+        <w:t>}da {shartnoma_raqami}-sonli aktivni {shartnoma_turi} (keyingi o‘rinlarda — Shartnoma) tuzilgan bo‘lib, mazkur Shartnoma asosida Sizga {xizmat_turi} ko‘rsatilgan.</w:t>
       </w:r>
     </w:p>
     <w:p>
@@ -413,7 +413,7 @@
           <w:sz w:val="26"/>
           <w:szCs w:val="26"/>
         </w:rPr>
-        <w:t xml:space="preserve">Shartnomaning ajralmas qismi hisoblangan 1-ilovaga muvofiq, nasiya to‘lovlari har oyning </w:t>
+        <w:t xml:space="preserve">Shartnomaning ajralmas qismi hisoblangan 1-ilovaga muvofiq, {tolov_turi} har oyning </w:t>
       </w:r>
       <w:r>
         <w:rPr>
@@ -450,7 +450,7 @@
           <w:sz w:val="26"/>
           <w:szCs w:val="26"/>
         </w:rPr>
-        <w:t>Shuningdek, Shartnoma shartlariga ko‘ra, nasiya to‘lovlari belgilangan muddatda amalga oshirilmagan taqdirda, kechiktirilgan har bir kalendar kun uchun kechiktirilgan to‘lov summasining 0,4 foizi miqdorida hayriya to‘lovi hisoblanishi nazarda tutilgan.</w:t>
+        <w:t>Shuningdek, Shartnoma shartlariga ko‘ra, {tolov_turi} belgilangan muddatda amalga oshirilmagan taqdirda, kechiktirilgan har bir kalendar kun uchun kechiktirilgan to‘lov summasining 0,4 foizi miqdorida hayriya to‘lovi hisoblanishi nazarda tutilgan.</w:t>
       </w:r>
     </w:p>
     <w:p>
@@ -671,7 +671,7 @@
           <w:szCs w:val="26"/>
         </w:rPr>
         <w:tab/>
-        <w:t>Nasiya savdo obyektini qaytarish bo‘yicha choralar ko‘rish;</w:t>
+        <w:t>{obyekt_turi} qaytarish bo‘yicha choralar ko‘rish;</w:t>
       </w:r>
     </w:p>
     <w:p>

</xml_diff>